<commit_message>
fix(sdd): user can also use web
</commit_message>
<xml_diff>
--- a/docs/SDD_QueueMS_Barcenas.docx
+++ b/docs/SDD_QueueMS_Barcenas.docx
@@ -21,7 +21,7 @@
           <w:noProof/>
         </w:rPr>
         <w:drawing>
-          <wp:inline distT="0" distB="0" distL="0" distR="0" wp14:anchorId="5F328DB4" wp14:editId="20871158">
+          <wp:inline distT="0" distB="0" distL="0" distR="0" wp14:anchorId="5F328DB4" wp14:editId="54F3BAD2">
             <wp:extent cx="5943600" cy="1166495"/>
             <wp:effectExtent l="0" t="0" r="0" b="0"/>
             <wp:docPr id="856519106" name="Picture 1" descr="A black background with red text&#10;&#10;AI-generated content may be incorrect."/>
@@ -1790,31 +1790,23 @@
         </w:rPr>
       </w:pPr>
       <w:r>
-        <w:rPr>
-          <w:lang w:val="en-PH"/>
-        </w:rPr>
-        <w:t>The system is split across two client platforms: a </w:t>
+        <w:t xml:space="preserve">The system is split across two client platforms: a </w:t>
       </w:r>
       <w:r>
         <w:rPr>
           <w:b/>
           <w:bCs/>
-          <w:lang w:val="en-PH"/>
         </w:rPr>
         <w:t>Web application (React)</w:t>
       </w:r>
       <w:r>
-        <w:rPr>
-          <w:lang w:val="en-PH"/>
-        </w:rPr>
-        <w:t> used by </w:t>
+        <w:t xml:space="preserve"> used by </w:t>
       </w:r>
       <w:proofErr w:type="spellStart"/>
       <w:r>
         <w:rPr>
           <w:b/>
           <w:bCs/>
-          <w:lang w:val="en-PH"/>
         </w:rPr>
         <w:t>Superadmins</w:t>
       </w:r>
@@ -1823,43 +1815,31 @@
         <w:rPr>
           <w:b/>
           <w:bCs/>
-          <w:lang w:val="en-PH"/>
-        </w:rPr>
-        <w:t xml:space="preserve"> and Tellers</w:t>
-      </w:r>
-      <w:r>
-        <w:rPr>
-          <w:lang w:val="en-PH"/>
-        </w:rPr>
-        <w:t> to manage queues and system settings, and a </w:t>
+        </w:rPr>
+        <w:t>, Tellers, and Users</w:t>
+      </w:r>
+      <w:r>
+        <w:t xml:space="preserve"> to manage queues, system settings, and service requests, and a </w:t>
       </w:r>
       <w:r>
         <w:rPr>
           <w:b/>
           <w:bCs/>
-          <w:lang w:val="en-PH"/>
         </w:rPr>
         <w:t>Mobile application (Android/Kotlin)</w:t>
       </w:r>
       <w:r>
-        <w:rPr>
-          <w:lang w:val="en-PH"/>
-        </w:rPr>
-        <w:t> used by </w:t>
+        <w:t xml:space="preserve"> used by </w:t>
       </w:r>
       <w:r>
         <w:rPr>
           <w:b/>
           <w:bCs/>
-          <w:lang w:val="en-PH"/>
         </w:rPr>
         <w:t>Users (Students)</w:t>
       </w:r>
       <w:r>
-        <w:rPr>
-          <w:lang w:val="en-PH"/>
-        </w:rPr>
-        <w:t> to create and monitor service requests.</w:t>
+        <w:t xml:space="preserve"> as the primary mobile interface for creating and monitoring service requests.</w:t>
       </w:r>
     </w:p>
     <w:p>
@@ -3337,9 +3317,8 @@
       <w:r>
         <w:rPr>
           <w:rFonts w:asciiTheme="majorHAnsi" w:hAnsiTheme="majorHAnsi"/>
-          <w:lang w:val="en-PH"/>
-        </w:rPr>
-        <w:t>User registers or logs in via the Mobile App</w:t>
+        </w:rPr>
+        <w:t>User registers or logs in via the Mobile App or Web App</w:t>
       </w:r>
     </w:p>
     <w:p>
@@ -4164,7 +4143,17 @@
           <w:lang w:val="en-PH" w:eastAsia="en-PH"/>
           <w14:ligatures w14:val="none"/>
         </w:rPr>
-        <w:t>User/Student: Mobile App (Android/Kotlin)</w:t>
+        <w:t xml:space="preserve">User/Student: </w:t>
+      </w:r>
+      <w:r>
+        <w:rPr>
+          <w:rFonts w:eastAsia="Times New Roman" w:cs="Segoe UI"/>
+          <w:color w:val="1F2328"/>
+          <w:kern w:val="0"/>
+          <w:lang w:eastAsia="en-PH"/>
+          <w14:ligatures w14:val="none"/>
+        </w:rPr>
+        <w:t>Mobile App (Android/Kotlin) and Web App (React)</w:t>
       </w:r>
     </w:p>
     <w:p>
@@ -4337,6 +4326,32 @@
           <w14:ligatures w14:val="none"/>
         </w:rPr>
         <w:t>Mobile (User): Registration, Login</w:t>
+      </w:r>
+    </w:p>
+    <w:p>
+      <w:pPr>
+        <w:numPr>
+          <w:ilvl w:val="1"/>
+          <w:numId w:val="4"/>
+        </w:numPr>
+        <w:spacing w:before="60" w:after="100" w:afterAutospacing="1" w:line="240" w:lineRule="auto"/>
+        <w:rPr>
+          <w:rFonts w:eastAsia="Times New Roman" w:cs="Segoe UI"/>
+          <w:color w:val="1F2328"/>
+          <w:kern w:val="0"/>
+          <w:lang w:val="en-PH" w:eastAsia="en-PH"/>
+          <w14:ligatures w14:val="none"/>
+        </w:rPr>
+      </w:pPr>
+      <w:r>
+        <w:rPr>
+          <w:rFonts w:eastAsia="Times New Roman" w:cs="Segoe UI"/>
+          <w:color w:val="1F2328"/>
+          <w:kern w:val="0"/>
+          <w:lang w:eastAsia="en-PH"/>
+          <w14:ligatures w14:val="none"/>
+        </w:rPr>
+        <w:t>Web (User): Registration, Login — redirects to User Dashboard (queue status, create request, cancel request)</w:t>
       </w:r>
     </w:p>
     <w:p>
@@ -4862,7 +4877,23 @@
           <w:b/>
           <w:bCs/>
         </w:rPr>
-        <w:t>User-Facing (Mobile App):</w:t>
+        <w:t>User-Facing (Mobile App</w:t>
+      </w:r>
+      <w:r>
+        <w:rPr>
+          <w:rFonts w:asciiTheme="majorHAnsi" w:hAnsiTheme="majorHAnsi"/>
+          <w:b/>
+          <w:bCs/>
+        </w:rPr>
+        <w:t xml:space="preserve"> and Web App</w:t>
+      </w:r>
+      <w:r>
+        <w:rPr>
+          <w:rFonts w:asciiTheme="majorHAnsi" w:hAnsiTheme="majorHAnsi"/>
+          <w:b/>
+          <w:bCs/>
+        </w:rPr>
+        <w:t>):</w:t>
       </w:r>
     </w:p>
     <w:p>
@@ -5029,6 +5060,7 @@
           <w:lang w:val="en-PH" w:eastAsia="en-PH"/>
           <w14:ligatures w14:val="none"/>
         </w:rPr>
+        <w:lastRenderedPageBreak/>
         <w:t>Screens:</w:t>
       </w:r>
       <w:r>
@@ -5067,7 +5099,6 @@
           <w:lang w:val="en-PH" w:eastAsia="en-PH"/>
           <w14:ligatures w14:val="none"/>
         </w:rPr>
-        <w:lastRenderedPageBreak/>
         <w:t>Display:</w:t>
       </w:r>
       <w:r>
@@ -6383,6 +6414,7 @@
           <w:bCs/>
           <w:lang w:val="en-PH"/>
         </w:rPr>
+        <w:lastRenderedPageBreak/>
         <w:t>Feature: Email Notification (SMTP)</w:t>
       </w:r>
     </w:p>
@@ -6411,7 +6443,6 @@
           <w:lang w:val="en-PH" w:eastAsia="en-PH"/>
           <w14:ligatures w14:val="none"/>
         </w:rPr>
-        <w:lastRenderedPageBreak/>
         <w:t>Trigger Events:</w:t>
       </w:r>
       <w:r>
@@ -7155,9 +7186,8 @@
       <w:r>
         <w:rPr>
           <w:rFonts w:asciiTheme="majorHAnsi" w:hAnsiTheme="majorHAnsi"/>
-          <w:lang w:val="en-PH"/>
-        </w:rPr>
-        <w:t>Given I am a new user on the Mobile App</w:t>
+        </w:rPr>
+        <w:t>Given I am a new user on the Mobile App or Web App</w:t>
       </w:r>
     </w:p>
     <w:p>
@@ -7189,6 +7219,7 @@
           <w:rFonts w:asciiTheme="majorHAnsi" w:hAnsiTheme="majorHAnsi"/>
           <w:lang w:val="en-PH"/>
         </w:rPr>
+        <w:lastRenderedPageBreak/>
         <w:t>And confirm the password correctly</w:t>
       </w:r>
     </w:p>
@@ -7205,7 +7236,6 @@
           <w:rFonts w:asciiTheme="majorHAnsi" w:hAnsiTheme="majorHAnsi"/>
           <w:lang w:val="en-PH"/>
         </w:rPr>
-        <w:lastRenderedPageBreak/>
         <w:t>And click "Register"</w:t>
       </w:r>
     </w:p>
@@ -7271,6 +7301,19 @@
           <w:lang w:val="en-PH"/>
         </w:rPr>
         <w:t>And I should be able to log in via the Mobile App</w:t>
+      </w:r>
+      <w:r>
+        <w:rPr>
+          <w:rFonts w:asciiTheme="majorHAnsi" w:hAnsiTheme="majorHAnsi"/>
+          <w:lang w:val="en-PH"/>
+        </w:rPr>
+        <w:t xml:space="preserve"> </w:t>
+      </w:r>
+      <w:r>
+        <w:rPr>
+          <w:rFonts w:asciiTheme="majorHAnsi" w:hAnsiTheme="majorHAnsi"/>
+        </w:rPr>
+        <w:t>or Web App</w:t>
       </w:r>
     </w:p>
     <w:p>
@@ -7316,6 +7359,19 @@
         </w:rPr>
         <w:t>Given I am a User with a registered account on the Mobile App</w:t>
       </w:r>
+      <w:r>
+        <w:rPr>
+          <w:rFonts w:asciiTheme="majorHAnsi" w:hAnsiTheme="majorHAnsi"/>
+          <w:lang w:val="en-PH"/>
+        </w:rPr>
+        <w:t xml:space="preserve"> </w:t>
+      </w:r>
+      <w:r>
+        <w:rPr>
+          <w:rFonts w:asciiTheme="majorHAnsi" w:hAnsiTheme="majorHAnsi"/>
+        </w:rPr>
+        <w:t>or Web App</w:t>
+      </w:r>
     </w:p>
     <w:p>
       <w:pPr>
@@ -7362,7 +7418,13 @@
           <w:rFonts w:asciiTheme="majorHAnsi" w:hAnsiTheme="majorHAnsi"/>
           <w:lang w:val="en-PH"/>
         </w:rPr>
-        <w:t>And allow access to protected Mobile App pages</w:t>
+        <w:t xml:space="preserve">And allow access to protected </w:t>
+      </w:r>
+      <w:r>
+        <w:rPr>
+          <w:rFonts w:asciiTheme="majorHAnsi" w:hAnsiTheme="majorHAnsi"/>
+        </w:rPr>
+        <w:t>User pages on the Mobile App or Web App</w:t>
       </w:r>
     </w:p>
     <w:p>
@@ -7640,6 +7702,7 @@
           <w:rFonts w:asciiTheme="majorHAnsi" w:hAnsiTheme="majorHAnsi"/>
           <w:lang w:val="en-PH"/>
         </w:rPr>
+        <w:lastRenderedPageBreak/>
         <w:t>Then I should receive 403 Forbidden</w:t>
       </w:r>
     </w:p>
@@ -8112,6 +8175,7 @@
           <w:rFonts w:asciiTheme="majorHAnsi" w:hAnsiTheme="majorHAnsi"/>
           <w:lang w:val="en-PH"/>
         </w:rPr>
+        <w:lastRenderedPageBreak/>
         <w:t>Then the request status should be updated to "Cancelled"</w:t>
       </w:r>
     </w:p>
@@ -8128,7 +8192,6 @@
           <w:rFonts w:asciiTheme="majorHAnsi" w:hAnsiTheme="majorHAnsi"/>
           <w:lang w:val="en-PH"/>
         </w:rPr>
-        <w:lastRenderedPageBreak/>
         <w:t>And it should no longer appear in the active queue</w:t>
       </w:r>
     </w:p>
@@ -8529,6 +8592,7 @@
           <w:rFonts w:asciiTheme="majorHAnsi" w:hAnsiTheme="majorHAnsi"/>
           <w:lang w:val="en-PH"/>
         </w:rPr>
+        <w:lastRenderedPageBreak/>
         <w:t>Given I create a service request on the Mobile App</w:t>
       </w:r>
     </w:p>
@@ -8545,7 +8609,6 @@
           <w:rFonts w:asciiTheme="majorHAnsi" w:hAnsiTheme="majorHAnsi"/>
           <w:lang w:val="en-PH"/>
         </w:rPr>
-        <w:lastRenderedPageBreak/>
         <w:t>When the request is successfully submitted</w:t>
       </w:r>
     </w:p>
@@ -9080,6 +9143,7 @@
           <w:bCs/>
           <w:lang w:val="en-PH"/>
         </w:rPr>
+        <w:lastRenderedPageBreak/>
         <w:t>3.3 Compatibility Requirements</w:t>
       </w:r>
     </w:p>
@@ -9098,8 +9162,25 @@
           <w:bCs/>
           <w:lang w:val="en-PH"/>
         </w:rPr>
-        <w:lastRenderedPageBreak/>
-        <w:t>Web App (Admin only):</w:t>
+        <w:t xml:space="preserve">Web App (Admin </w:t>
+      </w:r>
+      <w:r>
+        <w:rPr>
+          <w:rFonts w:asciiTheme="majorHAnsi" w:hAnsiTheme="majorHAnsi"/>
+          <w:b/>
+          <w:bCs/>
+          <w:lang w:val="en-PH"/>
+        </w:rPr>
+        <w:t>and User</w:t>
+      </w:r>
+      <w:r>
+        <w:rPr>
+          <w:rFonts w:asciiTheme="majorHAnsi" w:hAnsiTheme="majorHAnsi"/>
+          <w:b/>
+          <w:bCs/>
+          <w:lang w:val="en-PH"/>
+        </w:rPr>
+        <w:t>):</w:t>
       </w:r>
     </w:p>
     <w:p>
@@ -9505,6 +9586,124 @@
           <w:bCs/>
           <w:lang w:val="en-PH"/>
         </w:rPr>
+        <w:t>Web App (User):</w:t>
+      </w:r>
+    </w:p>
+    <w:p>
+      <w:pPr>
+        <w:numPr>
+          <w:ilvl w:val="0"/>
+          <w:numId w:val="31"/>
+        </w:numPr>
+        <w:spacing w:line="240" w:lineRule="auto"/>
+        <w:rPr>
+          <w:rFonts w:asciiTheme="majorHAnsi" w:hAnsiTheme="majorHAnsi"/>
+          <w:lang w:val="en-PH"/>
+        </w:rPr>
+      </w:pPr>
+      <w:r>
+        <w:rPr>
+          <w:rFonts w:asciiTheme="majorHAnsi" w:hAnsiTheme="majorHAnsi"/>
+          <w:lang w:val="en-PH"/>
+        </w:rPr>
+        <w:t>Users should be able to create a service request within 3 minutes via the browser</w:t>
+      </w:r>
+    </w:p>
+    <w:p>
+      <w:pPr>
+        <w:numPr>
+          <w:ilvl w:val="0"/>
+          <w:numId w:val="31"/>
+        </w:numPr>
+        <w:spacing w:line="240" w:lineRule="auto"/>
+        <w:rPr>
+          <w:rFonts w:asciiTheme="majorHAnsi" w:hAnsiTheme="majorHAnsi"/>
+          <w:lang w:val="en-PH"/>
+        </w:rPr>
+      </w:pPr>
+      <w:r>
+        <w:rPr>
+          <w:rFonts w:asciiTheme="majorHAnsi" w:hAnsiTheme="majorHAnsi"/>
+          <w:lang w:val="en-PH"/>
+        </w:rPr>
+        <w:t>Clear queue position visibility on the User Web dashboard</w:t>
+      </w:r>
+    </w:p>
+    <w:p>
+      <w:pPr>
+        <w:numPr>
+          <w:ilvl w:val="0"/>
+          <w:numId w:val="31"/>
+        </w:numPr>
+        <w:spacing w:line="240" w:lineRule="auto"/>
+        <w:rPr>
+          <w:rFonts w:asciiTheme="majorHAnsi" w:hAnsiTheme="majorHAnsi"/>
+          <w:lang w:val="en-PH"/>
+        </w:rPr>
+      </w:pPr>
+      <w:r>
+        <w:rPr>
+          <w:rFonts w:asciiTheme="majorHAnsi" w:hAnsiTheme="majorHAnsi"/>
+          <w:lang w:val="en-PH"/>
+        </w:rPr>
+        <w:t>Consistent navigation across all web user screens</w:t>
+      </w:r>
+    </w:p>
+    <w:p>
+      <w:pPr>
+        <w:numPr>
+          <w:ilvl w:val="0"/>
+          <w:numId w:val="31"/>
+        </w:numPr>
+        <w:spacing w:line="240" w:lineRule="auto"/>
+        <w:rPr>
+          <w:rFonts w:asciiTheme="majorHAnsi" w:hAnsiTheme="majorHAnsi"/>
+          <w:lang w:val="en-PH"/>
+        </w:rPr>
+      </w:pPr>
+      <w:r>
+        <w:rPr>
+          <w:rFonts w:asciiTheme="majorHAnsi" w:hAnsiTheme="majorHAnsi"/>
+          <w:lang w:val="en-PH"/>
+        </w:rPr>
+        <w:t>Clear validation and error messages with recovery options</w:t>
+      </w:r>
+    </w:p>
+    <w:p>
+      <w:pPr>
+        <w:numPr>
+          <w:ilvl w:val="0"/>
+          <w:numId w:val="31"/>
+        </w:numPr>
+        <w:spacing w:line="240" w:lineRule="auto"/>
+        <w:rPr>
+          <w:rFonts w:asciiTheme="majorHAnsi" w:hAnsiTheme="majorHAnsi"/>
+          <w:lang w:val="en-PH"/>
+        </w:rPr>
+      </w:pPr>
+      <w:r>
+        <w:rPr>
+          <w:rFonts w:asciiTheme="majorHAnsi" w:hAnsiTheme="majorHAnsi"/>
+          <w:lang w:val="en-PH"/>
+        </w:rPr>
+        <w:t>Responsive design supporting tablet (768px) and desktop (1024px)</w:t>
+      </w:r>
+    </w:p>
+    <w:p>
+      <w:pPr>
+        <w:spacing w:line="240" w:lineRule="auto"/>
+        <w:rPr>
+          <w:rFonts w:asciiTheme="majorHAnsi" w:hAnsiTheme="majorHAnsi"/>
+          <w:lang w:val="en-PH"/>
+        </w:rPr>
+      </w:pPr>
+      <w:r>
+        <w:rPr>
+          <w:rFonts w:asciiTheme="majorHAnsi" w:hAnsiTheme="majorHAnsi"/>
+          <w:b/>
+          <w:bCs/>
+          <w:lang w:val="en-PH"/>
+        </w:rPr>
         <w:t>Web App (</w:t>
       </w:r>
       <w:r>
@@ -9580,6 +9779,7 @@
           <w:rFonts w:asciiTheme="majorHAnsi" w:hAnsiTheme="majorHAnsi"/>
           <w:lang w:val="en-PH"/>
         </w:rPr>
+        <w:lastRenderedPageBreak/>
         <w:t>Keyboard navigation support</w:t>
       </w:r>
     </w:p>
@@ -9728,7 +9928,6 @@
           <w:rFonts w:asciiTheme="majorHAnsi" w:hAnsiTheme="majorHAnsi"/>
           <w:lang w:val="en-PH"/>
         </w:rPr>
-        <w:lastRenderedPageBreak/>
         <w:t>Consistent and intuitive admin dashboard layout</w:t>
       </w:r>
     </w:p>
@@ -10793,6 +10992,7 @@
           <w:color w:val="1F2228"/>
           <w:w w:val="85"/>
         </w:rPr>
+        <w:lastRenderedPageBreak/>
         <w:t>+</w:t>
       </w:r>
       <w:r>
@@ -11773,6 +11973,7 @@
                 <w:bCs/>
                 <w:lang w:val="en-PH"/>
               </w:rPr>
+              <w:lastRenderedPageBreak/>
               <w:t>HTTP Method</w:t>
             </w:r>
           </w:p>
@@ -12088,15 +12289,7 @@
                 <w:rFonts w:asciiTheme="majorHAnsi" w:hAnsiTheme="majorHAnsi"/>
                 <w:lang w:val="en-PH"/>
               </w:rPr>
-              <w:t xml:space="preserve">&gt;", "role": "&lt;USER or </w:t>
-            </w:r>
-            <w:r>
-              <w:rPr>
-                <w:rFonts w:asciiTheme="majorHAnsi" w:hAnsiTheme="majorHAnsi"/>
-                <w:lang w:val="en-PH"/>
-              </w:rPr>
-              <w:lastRenderedPageBreak/>
-              <w:t>TELLER or SUPERADMIN&gt;</w:t>
+              <w:t>&gt;", "role": "&lt;USER or TELLER or SUPERADMIN&gt;</w:t>
             </w:r>
             <w:proofErr w:type="gramStart"/>
             <w:r>
@@ -12691,6 +12884,7 @@
                 <w:bCs/>
                 <w:lang w:val="en-PH"/>
               </w:rPr>
+              <w:lastRenderedPageBreak/>
               <w:t>Response Structure</w:t>
             </w:r>
           </w:p>
@@ -12938,7 +13132,6 @@
           <w:rFonts w:asciiTheme="majorHAnsi" w:hAnsiTheme="majorHAnsi"/>
           <w:lang w:val="en-PH"/>
         </w:rPr>
-        <w:lastRenderedPageBreak/>
         <w:t xml:space="preserve"> </w:t>
       </w:r>
     </w:p>
@@ -13356,37 +13549,12 @@
                 <w:lang w:val="en-PH"/>
               </w:rPr>
             </w:pPr>
-            <w:proofErr w:type="gramStart"/>
-            <w:r>
-              <w:rPr>
-                <w:rFonts w:asciiTheme="majorHAnsi" w:hAnsiTheme="majorHAnsi"/>
-                <w:lang w:val="en-PH"/>
-              </w:rPr>
-              <w:t>{ "</w:t>
-            </w:r>
-            <w:proofErr w:type="gramEnd"/>
-            <w:r>
-              <w:rPr>
-                <w:rFonts w:asciiTheme="majorHAnsi" w:hAnsiTheme="majorHAnsi"/>
-                <w:lang w:val="en-PH"/>
-              </w:rPr>
-              <w:t xml:space="preserve">success": true, "data": [ </w:t>
-            </w:r>
-            <w:proofErr w:type="gramStart"/>
-            <w:r>
-              <w:rPr>
-                <w:rFonts w:asciiTheme="majorHAnsi" w:hAnsiTheme="majorHAnsi"/>
-                <w:lang w:val="en-PH"/>
-              </w:rPr>
-              <w:t>{ "</w:t>
-            </w:r>
-            <w:proofErr w:type="gramEnd"/>
-            <w:r>
-              <w:rPr>
-                <w:rFonts w:asciiTheme="majorHAnsi" w:hAnsiTheme="majorHAnsi"/>
-                <w:lang w:val="en-PH"/>
-              </w:rPr>
-              <w:t>id": "&lt;</w:t>
+            <w:r>
+              <w:rPr>
+                <w:rFonts w:asciiTheme="majorHAnsi" w:hAnsiTheme="majorHAnsi"/>
+                <w:lang w:val="en-PH"/>
+              </w:rPr>
+              <w:t>{ "success": true, "data": [ { "id": "&lt;</w:t>
             </w:r>
             <w:proofErr w:type="spellStart"/>
             <w:r>
@@ -13498,33 +13666,8 @@
                 <w:rFonts w:asciiTheme="majorHAnsi" w:hAnsiTheme="majorHAnsi"/>
                 <w:lang w:val="en-PH"/>
               </w:rPr>
-              <w:t>": "&lt;ISO 8601 datetime&gt;</w:t>
-            </w:r>
-            <w:proofErr w:type="gramStart"/>
-            <w:r>
-              <w:rPr>
-                <w:rFonts w:asciiTheme="majorHAnsi" w:hAnsiTheme="majorHAnsi"/>
-                <w:lang w:val="en-PH"/>
-              </w:rPr>
-              <w:t>" }</w:t>
-            </w:r>
-            <w:proofErr w:type="gramEnd"/>
-            <w:r>
-              <w:rPr>
-                <w:rFonts w:asciiTheme="majorHAnsi" w:hAnsiTheme="majorHAnsi"/>
-                <w:lang w:val="en-PH"/>
-              </w:rPr>
-              <w:t xml:space="preserve"> ], "error": null, "timestamp": "&lt;ISO 8601 datetime&gt;</w:t>
-            </w:r>
-            <w:proofErr w:type="gramStart"/>
-            <w:r>
-              <w:rPr>
-                <w:rFonts w:asciiTheme="majorHAnsi" w:hAnsiTheme="majorHAnsi"/>
-                <w:lang w:val="en-PH"/>
-              </w:rPr>
-              <w:t>" }</w:t>
-            </w:r>
-            <w:proofErr w:type="gramEnd"/>
+              <w:t>": "&lt;ISO 8601 datetime&gt;" } ], "error": null, "timestamp": "&lt;ISO 8601 datetime&gt;" }</w:t>
+            </w:r>
           </w:p>
         </w:tc>
       </w:tr>
@@ -13967,7 +14110,6 @@
                 <w:bCs/>
                 <w:lang w:val="en-PH"/>
               </w:rPr>
-              <w:lastRenderedPageBreak/>
               <w:t>Response Structure</w:t>
             </w:r>
           </w:p>
@@ -14547,6 +14689,7 @@
                 <w:bCs/>
                 <w:lang w:val="en-PH"/>
               </w:rPr>
+              <w:lastRenderedPageBreak/>
               <w:t>Response Structure</w:t>
             </w:r>
           </w:p>
@@ -16381,6 +16524,7 @@
                 <w:bCs/>
                 <w:lang w:val="en-PH"/>
               </w:rPr>
+              <w:lastRenderedPageBreak/>
               <w:t>Request Payload</w:t>
             </w:r>
           </w:p>
@@ -17424,6 +17568,7 @@
           <w:rFonts w:asciiTheme="majorHAnsi" w:hAnsiTheme="majorHAnsi"/>
           <w:lang w:val="en-PH"/>
         </w:rPr>
+        <w:lastRenderedPageBreak/>
         <w:t xml:space="preserve"> </w:t>
       </w:r>
     </w:p>
@@ -17908,7 +18053,6 @@
                 <w:bCs/>
                 <w:lang w:val="en-PH"/>
               </w:rPr>
-              <w:lastRenderedPageBreak/>
               <w:t>Response Structure</w:t>
             </w:r>
           </w:p>
@@ -18594,6 +18738,7 @@
                 <w:bCs/>
                 <w:lang w:val="en-PH"/>
               </w:rPr>
+              <w:lastRenderedPageBreak/>
               <w:t>409 Conflict</w:t>
             </w:r>
           </w:p>
@@ -19337,6 +19482,7 @@
           <w:bCs/>
           <w:lang w:val="en-PH"/>
         </w:rPr>
+        <w:lastRenderedPageBreak/>
         <w:t>Common Error Codes</w:t>
       </w:r>
     </w:p>
@@ -19743,7 +19889,6 @@
                 <w:bCs/>
                 <w:lang w:val="en-PH"/>
               </w:rPr>
-              <w:lastRenderedPageBreak/>
               <w:t>DB-002</w:t>
             </w:r>
           </w:p>
@@ -29233,7 +29378,6 @@
       <w:lvlJc w:val="left"/>
       <w:pPr>
         <w:ind w:left="836" w:hanging="476"/>
-        <w:jc w:val="left"/>
       </w:pPr>
       <w:rPr>
         <w:rFonts w:hint="default"/>
@@ -29246,7 +29390,6 @@
       <w:lvlJc w:val="left"/>
       <w:pPr>
         <w:ind w:left="836" w:hanging="476"/>
-        <w:jc w:val="left"/>
       </w:pPr>
       <w:rPr>
         <w:rFonts w:hint="default"/>
@@ -30927,9 +31070,9 @@
     </w:lvl>
   </w:abstractNum>
   <w:abstractNum w:abstractNumId="26" w15:restartNumberingAfterBreak="0">
-    <w:nsid w:val="74CC11D6"/>
+    <w:nsid w:val="71593D8F"/>
     <w:multiLevelType w:val="multilevel"/>
-    <w:tmpl w:val="EF7C04A2"/>
+    <w:tmpl w:val="BD88A64A"/>
     <w:lvl w:ilvl="0">
       <w:start w:val="1"/>
       <w:numFmt w:val="bullet"/>
@@ -31076,6 +31219,155 @@
     </w:lvl>
   </w:abstractNum>
   <w:abstractNum w:abstractNumId="27" w15:restartNumberingAfterBreak="0">
+    <w:nsid w:val="74CC11D6"/>
+    <w:multiLevelType w:val="multilevel"/>
+    <w:tmpl w:val="EF7C04A2"/>
+    <w:lvl w:ilvl="0">
+      <w:start w:val="1"/>
+      <w:numFmt w:val="bullet"/>
+      <w:lvlText w:val=""/>
+      <w:lvlJc w:val="left"/>
+      <w:pPr>
+        <w:tabs>
+          <w:tab w:val="num" w:pos="720"/>
+        </w:tabs>
+        <w:ind w:left="720" w:hanging="360"/>
+      </w:pPr>
+      <w:rPr>
+        <w:rFonts w:ascii="Symbol" w:hAnsi="Symbol" w:hint="default"/>
+        <w:sz w:val="20"/>
+      </w:rPr>
+    </w:lvl>
+    <w:lvl w:ilvl="1" w:tentative="1">
+      <w:start w:val="1"/>
+      <w:numFmt w:val="bullet"/>
+      <w:lvlText w:val="o"/>
+      <w:lvlJc w:val="left"/>
+      <w:pPr>
+        <w:tabs>
+          <w:tab w:val="num" w:pos="1440"/>
+        </w:tabs>
+        <w:ind w:left="1440" w:hanging="360"/>
+      </w:pPr>
+      <w:rPr>
+        <w:rFonts w:ascii="Courier New" w:hAnsi="Courier New" w:hint="default"/>
+        <w:sz w:val="20"/>
+      </w:rPr>
+    </w:lvl>
+    <w:lvl w:ilvl="2" w:tentative="1">
+      <w:start w:val="1"/>
+      <w:numFmt w:val="bullet"/>
+      <w:lvlText w:val=""/>
+      <w:lvlJc w:val="left"/>
+      <w:pPr>
+        <w:tabs>
+          <w:tab w:val="num" w:pos="2160"/>
+        </w:tabs>
+        <w:ind w:left="2160" w:hanging="360"/>
+      </w:pPr>
+      <w:rPr>
+        <w:rFonts w:ascii="Wingdings" w:hAnsi="Wingdings" w:hint="default"/>
+        <w:sz w:val="20"/>
+      </w:rPr>
+    </w:lvl>
+    <w:lvl w:ilvl="3" w:tentative="1">
+      <w:start w:val="1"/>
+      <w:numFmt w:val="bullet"/>
+      <w:lvlText w:val=""/>
+      <w:lvlJc w:val="left"/>
+      <w:pPr>
+        <w:tabs>
+          <w:tab w:val="num" w:pos="2880"/>
+        </w:tabs>
+        <w:ind w:left="2880" w:hanging="360"/>
+      </w:pPr>
+      <w:rPr>
+        <w:rFonts w:ascii="Wingdings" w:hAnsi="Wingdings" w:hint="default"/>
+        <w:sz w:val="20"/>
+      </w:rPr>
+    </w:lvl>
+    <w:lvl w:ilvl="4" w:tentative="1">
+      <w:start w:val="1"/>
+      <w:numFmt w:val="bullet"/>
+      <w:lvlText w:val=""/>
+      <w:lvlJc w:val="left"/>
+      <w:pPr>
+        <w:tabs>
+          <w:tab w:val="num" w:pos="3600"/>
+        </w:tabs>
+        <w:ind w:left="3600" w:hanging="360"/>
+      </w:pPr>
+      <w:rPr>
+        <w:rFonts w:ascii="Wingdings" w:hAnsi="Wingdings" w:hint="default"/>
+        <w:sz w:val="20"/>
+      </w:rPr>
+    </w:lvl>
+    <w:lvl w:ilvl="5" w:tentative="1">
+      <w:start w:val="1"/>
+      <w:numFmt w:val="bullet"/>
+      <w:lvlText w:val=""/>
+      <w:lvlJc w:val="left"/>
+      <w:pPr>
+        <w:tabs>
+          <w:tab w:val="num" w:pos="4320"/>
+        </w:tabs>
+        <w:ind w:left="4320" w:hanging="360"/>
+      </w:pPr>
+      <w:rPr>
+        <w:rFonts w:ascii="Wingdings" w:hAnsi="Wingdings" w:hint="default"/>
+        <w:sz w:val="20"/>
+      </w:rPr>
+    </w:lvl>
+    <w:lvl w:ilvl="6" w:tentative="1">
+      <w:start w:val="1"/>
+      <w:numFmt w:val="bullet"/>
+      <w:lvlText w:val=""/>
+      <w:lvlJc w:val="left"/>
+      <w:pPr>
+        <w:tabs>
+          <w:tab w:val="num" w:pos="5040"/>
+        </w:tabs>
+        <w:ind w:left="5040" w:hanging="360"/>
+      </w:pPr>
+      <w:rPr>
+        <w:rFonts w:ascii="Wingdings" w:hAnsi="Wingdings" w:hint="default"/>
+        <w:sz w:val="20"/>
+      </w:rPr>
+    </w:lvl>
+    <w:lvl w:ilvl="7" w:tentative="1">
+      <w:start w:val="1"/>
+      <w:numFmt w:val="bullet"/>
+      <w:lvlText w:val=""/>
+      <w:lvlJc w:val="left"/>
+      <w:pPr>
+        <w:tabs>
+          <w:tab w:val="num" w:pos="5760"/>
+        </w:tabs>
+        <w:ind w:left="5760" w:hanging="360"/>
+      </w:pPr>
+      <w:rPr>
+        <w:rFonts w:ascii="Wingdings" w:hAnsi="Wingdings" w:hint="default"/>
+        <w:sz w:val="20"/>
+      </w:rPr>
+    </w:lvl>
+    <w:lvl w:ilvl="8" w:tentative="1">
+      <w:start w:val="1"/>
+      <w:numFmt w:val="bullet"/>
+      <w:lvlText w:val=""/>
+      <w:lvlJc w:val="left"/>
+      <w:pPr>
+        <w:tabs>
+          <w:tab w:val="num" w:pos="6480"/>
+        </w:tabs>
+        <w:ind w:left="6480" w:hanging="360"/>
+      </w:pPr>
+      <w:rPr>
+        <w:rFonts w:ascii="Wingdings" w:hAnsi="Wingdings" w:hint="default"/>
+        <w:sz w:val="20"/>
+      </w:rPr>
+    </w:lvl>
+  </w:abstractNum>
+  <w:abstractNum w:abstractNumId="28" w15:restartNumberingAfterBreak="0">
     <w:nsid w:val="77C33E52"/>
     <w:multiLevelType w:val="multilevel"/>
     <w:tmpl w:val="0594819E"/>
@@ -31224,7 +31516,7 @@
       </w:rPr>
     </w:lvl>
   </w:abstractNum>
-  <w:abstractNum w:abstractNumId="28" w15:restartNumberingAfterBreak="0">
+  <w:abstractNum w:abstractNumId="29" w15:restartNumberingAfterBreak="0">
     <w:nsid w:val="7A9213AE"/>
     <w:multiLevelType w:val="multilevel"/>
     <w:tmpl w:val="36AE0C60"/>
@@ -31373,7 +31665,7 @@
       </w:rPr>
     </w:lvl>
   </w:abstractNum>
-  <w:abstractNum w:abstractNumId="29" w15:restartNumberingAfterBreak="0">
+  <w:abstractNum w:abstractNumId="30" w15:restartNumberingAfterBreak="0">
     <w:nsid w:val="7E51373E"/>
     <w:multiLevelType w:val="multilevel"/>
     <w:tmpl w:val="02327710"/>
@@ -31493,7 +31785,7 @@
     <w:abstractNumId w:val="18"/>
   </w:num>
   <w:num w:numId="3" w16cid:durableId="1179126848">
-    <w:abstractNumId w:val="29"/>
+    <w:abstractNumId w:val="30"/>
   </w:num>
   <w:num w:numId="4" w16cid:durableId="171645904">
     <w:abstractNumId w:val="12"/>
@@ -31532,16 +31824,16 @@
     <w:abstractNumId w:val="2"/>
   </w:num>
   <w:num w:numId="16" w16cid:durableId="260728359">
-    <w:abstractNumId w:val="26"/>
+    <w:abstractNumId w:val="27"/>
   </w:num>
   <w:num w:numId="17" w16cid:durableId="2135368106">
-    <w:abstractNumId w:val="27"/>
+    <w:abstractNumId w:val="28"/>
   </w:num>
   <w:num w:numId="18" w16cid:durableId="1404061778">
     <w:abstractNumId w:val="9"/>
   </w:num>
   <w:num w:numId="19" w16cid:durableId="152337032">
-    <w:abstractNumId w:val="28"/>
+    <w:abstractNumId w:val="29"/>
   </w:num>
   <w:num w:numId="20" w16cid:durableId="536167183">
     <w:abstractNumId w:val="19"/>
@@ -31586,6 +31878,9 @@
   </w:num>
   <w:num w:numId="30" w16cid:durableId="1914469785">
     <w:abstractNumId w:val="13"/>
+  </w:num>
+  <w:num w:numId="31" w16cid:durableId="2050957165">
+    <w:abstractNumId w:val="26"/>
   </w:num>
   <w:numIdMacAtCleanup w:val="30"/>
 </w:numbering>
@@ -32193,7 +32488,6 @@
   <w:style w:type="character" w:default="1" w:styleId="DefaultParagraphFont">
     <w:name w:val="Default Paragraph Font"/>
     <w:uiPriority w:val="1"/>
-    <w:semiHidden/>
     <w:unhideWhenUsed/>
   </w:style>
   <w:style w:type="table" w:default="1" w:styleId="TableNormal">

</xml_diff>

<commit_message>
docs(sdd): improving and updating the document
</commit_message>
<xml_diff>
--- a/docs/SDD_QueueMS_Barcenas.docx
+++ b/docs/SDD_QueueMS_Barcenas.docx
@@ -21,7 +21,7 @@
           <w:noProof/>
         </w:rPr>
         <w:drawing>
-          <wp:inline distT="0" distB="0" distL="0" distR="0" wp14:anchorId="5F328DB4" wp14:editId="54F3BAD2">
+          <wp:inline distT="0" distB="0" distL="0" distR="0" wp14:anchorId="5F328DB4" wp14:editId="65C6888E">
             <wp:extent cx="5943600" cy="1166495"/>
             <wp:effectExtent l="0" t="0" r="0" b="0"/>
             <wp:docPr id="856519106" name="Picture 1" descr="A black background with red text&#10;&#10;AI-generated content may be incorrect."/>
@@ -923,6 +923,176 @@
                 <w14:ligatures w14:val="none"/>
               </w:rPr>
               <w:t>Major change</w:t>
+            </w:r>
+          </w:p>
+        </w:tc>
+        <w:tc>
+          <w:tcPr>
+            <w:tcW w:w="2070" w:type="dxa"/>
+            <w:tcBorders>
+              <w:top w:val="single" w:sz="4" w:space="0" w:color="auto"/>
+              <w:left w:val="nil"/>
+              <w:bottom w:val="single" w:sz="4" w:space="0" w:color="auto"/>
+              <w:right w:val="single" w:sz="4" w:space="0" w:color="auto"/>
+            </w:tcBorders>
+            <w:shd w:val="clear" w:color="000000" w:fill="FFFFFF"/>
+            <w:vAlign w:val="center"/>
+          </w:tcPr>
+          <w:p>
+            <w:pPr>
+              <w:spacing w:after="0" w:line="240" w:lineRule="auto"/>
+              <w:rPr>
+                <w:rFonts w:asciiTheme="majorHAnsi" w:eastAsia="Times New Roman" w:hAnsiTheme="majorHAnsi" w:cs="Segoe UI"/>
+                <w:color w:val="0F1115"/>
+                <w:kern w:val="0"/>
+                <w14:ligatures w14:val="none"/>
+              </w:rPr>
+            </w:pPr>
+            <w:r>
+              <w:rPr>
+                <w:rFonts w:asciiTheme="majorHAnsi" w:eastAsia="Times New Roman" w:hAnsiTheme="majorHAnsi" w:cs="Segoe UI"/>
+                <w:color w:val="0F1115"/>
+                <w:kern w:val="0"/>
+                <w14:ligatures w14:val="none"/>
+              </w:rPr>
+              <w:t>Draft</w:t>
+            </w:r>
+          </w:p>
+        </w:tc>
+      </w:tr>
+      <w:tr>
+        <w:trPr>
+          <w:trHeight w:val="288"/>
+        </w:trPr>
+        <w:tc>
+          <w:tcPr>
+            <w:tcW w:w="1036" w:type="dxa"/>
+            <w:tcBorders>
+              <w:top w:val="single" w:sz="4" w:space="0" w:color="auto"/>
+              <w:left w:val="single" w:sz="4" w:space="0" w:color="auto"/>
+              <w:bottom w:val="single" w:sz="4" w:space="0" w:color="auto"/>
+              <w:right w:val="single" w:sz="4" w:space="0" w:color="auto"/>
+            </w:tcBorders>
+            <w:shd w:val="clear" w:color="000000" w:fill="FFFFFF"/>
+            <w:vAlign w:val="center"/>
+          </w:tcPr>
+          <w:p>
+            <w:pPr>
+              <w:spacing w:after="0" w:line="240" w:lineRule="auto"/>
+              <w:rPr>
+                <w:rFonts w:asciiTheme="majorHAnsi" w:eastAsia="Times New Roman" w:hAnsiTheme="majorHAnsi" w:cs="Segoe UI"/>
+                <w:color w:val="0F1115"/>
+                <w:kern w:val="0"/>
+                <w14:ligatures w14:val="none"/>
+              </w:rPr>
+            </w:pPr>
+            <w:r>
+              <w:rPr>
+                <w:rFonts w:asciiTheme="majorHAnsi" w:eastAsia="Times New Roman" w:hAnsiTheme="majorHAnsi" w:cs="Segoe UI"/>
+                <w:color w:val="0F1115"/>
+                <w:kern w:val="0"/>
+                <w14:ligatures w14:val="none"/>
+              </w:rPr>
+              <w:t>2.1</w:t>
+            </w:r>
+          </w:p>
+        </w:tc>
+        <w:tc>
+          <w:tcPr>
+            <w:tcW w:w="1479" w:type="dxa"/>
+            <w:tcBorders>
+              <w:top w:val="single" w:sz="4" w:space="0" w:color="auto"/>
+              <w:left w:val="nil"/>
+              <w:bottom w:val="single" w:sz="4" w:space="0" w:color="auto"/>
+              <w:right w:val="single" w:sz="4" w:space="0" w:color="auto"/>
+            </w:tcBorders>
+            <w:shd w:val="clear" w:color="000000" w:fill="FFFFFF"/>
+            <w:vAlign w:val="center"/>
+          </w:tcPr>
+          <w:p>
+            <w:pPr>
+              <w:spacing w:after="0" w:line="240" w:lineRule="auto"/>
+              <w:rPr>
+                <w:rFonts w:asciiTheme="majorHAnsi" w:eastAsia="Times New Roman" w:hAnsiTheme="majorHAnsi" w:cs="Segoe UI"/>
+                <w:color w:val="0F1115"/>
+                <w:kern w:val="0"/>
+                <w14:ligatures w14:val="none"/>
+              </w:rPr>
+            </w:pPr>
+            <w:r>
+              <w:rPr>
+                <w:rFonts w:asciiTheme="majorHAnsi" w:eastAsia="Times New Roman" w:hAnsiTheme="majorHAnsi" w:cs="Segoe UI"/>
+                <w:color w:val="0F1115"/>
+                <w:kern w:val="0"/>
+                <w14:ligatures w14:val="none"/>
+              </w:rPr>
+              <w:t>03/31/2026</w:t>
+            </w:r>
+          </w:p>
+        </w:tc>
+        <w:tc>
+          <w:tcPr>
+            <w:tcW w:w="2250" w:type="dxa"/>
+            <w:tcBorders>
+              <w:top w:val="single" w:sz="4" w:space="0" w:color="auto"/>
+              <w:left w:val="nil"/>
+              <w:bottom w:val="single" w:sz="4" w:space="0" w:color="auto"/>
+              <w:right w:val="single" w:sz="4" w:space="0" w:color="auto"/>
+            </w:tcBorders>
+            <w:shd w:val="clear" w:color="000000" w:fill="FFFFFF"/>
+            <w:vAlign w:val="center"/>
+          </w:tcPr>
+          <w:p>
+            <w:pPr>
+              <w:spacing w:after="0" w:line="240" w:lineRule="auto"/>
+              <w:rPr>
+                <w:rFonts w:asciiTheme="majorHAnsi" w:eastAsia="Times New Roman" w:hAnsiTheme="majorHAnsi" w:cs="Segoe UI"/>
+                <w:color w:val="0F1115"/>
+                <w:kern w:val="0"/>
+                <w14:ligatures w14:val="none"/>
+              </w:rPr>
+            </w:pPr>
+            <w:r>
+              <w:rPr>
+                <w:rFonts w:asciiTheme="majorHAnsi" w:eastAsia="Times New Roman" w:hAnsiTheme="majorHAnsi" w:cs="Segoe UI"/>
+                <w:color w:val="0F1115"/>
+                <w:kern w:val="0"/>
+                <w14:ligatures w14:val="none"/>
+              </w:rPr>
+              <w:t>Barcenas, Jon Vic T.</w:t>
+            </w:r>
+          </w:p>
+        </w:tc>
+        <w:tc>
+          <w:tcPr>
+            <w:tcW w:w="2610" w:type="dxa"/>
+            <w:tcBorders>
+              <w:top w:val="single" w:sz="4" w:space="0" w:color="auto"/>
+              <w:left w:val="nil"/>
+              <w:bottom w:val="single" w:sz="4" w:space="0" w:color="auto"/>
+              <w:right w:val="single" w:sz="4" w:space="0" w:color="auto"/>
+            </w:tcBorders>
+            <w:shd w:val="clear" w:color="000000" w:fill="FFFFFF"/>
+            <w:vAlign w:val="center"/>
+          </w:tcPr>
+          <w:p>
+            <w:pPr>
+              <w:spacing w:after="0" w:line="240" w:lineRule="auto"/>
+              <w:rPr>
+                <w:rFonts w:asciiTheme="majorHAnsi" w:eastAsia="Times New Roman" w:hAnsiTheme="majorHAnsi" w:cs="Segoe UI"/>
+                <w:color w:val="0F1115"/>
+                <w:kern w:val="0"/>
+                <w14:ligatures w14:val="none"/>
+              </w:rPr>
+            </w:pPr>
+            <w:r>
+              <w:rPr>
+                <w:rFonts w:asciiTheme="majorHAnsi" w:eastAsia="Times New Roman" w:hAnsiTheme="majorHAnsi" w:cs="Segoe UI"/>
+                <w:color w:val="0F1115"/>
+                <w:kern w:val="0"/>
+                <w14:ligatures w14:val="none"/>
+              </w:rPr>
+              <w:t>Minor change</w:t>
             </w:r>
           </w:p>
         </w:tc>
@@ -26812,7 +26982,7 @@
         <w:ind w:left="-120"/>
       </w:pPr>
       <w:r>
-        <w:t>Day 1: Android Studio setup, Kotlin + Jetpack Compose project structure</w:t>
+        <w:t>Day 1: Android Studio setup, Kotlin project structure</w:t>
       </w:r>
     </w:p>
     <w:p>
@@ -32488,6 +32658,7 @@
   <w:style w:type="character" w:default="1" w:styleId="DefaultParagraphFont">
     <w:name w:val="Default Paragraph Font"/>
     <w:uiPriority w:val="1"/>
+    <w:semiHidden/>
     <w:unhideWhenUsed/>
   </w:style>
   <w:style w:type="table" w:default="1" w:styleId="TableNormal">

</xml_diff>